<commit_message>
content: reposition the site around Statecraft, add the rename essay
Chrome (home, about, press, projects, work, now, README) now names
statecraft, enrahitu, and statecraft-cli instead of the retired
open-agentic-platform, OPC, and factory/template-encore. The six
essays that reference the old platform keep their prose and gain a
July 2026 update note pointing at the new anchor essay, From Open
Agentic Platform to Statecraft. Feeds and sitemap regenerated.
</commit_message>
<xml_diff>
--- a/public/Bartlomiej_Kus_Resume.docx
+++ b/public/Bartlomiej_Kus_Resume.docx
@@ -50,7 +50,7 @@
       <w:pPr>
         <w:spacing w:after="0"/>
       </w:pPr>
-      <w:hyperlink w:history="1" r:id="rIdlgyhfd3e9cjyl_40vua2-">
+      <w:hyperlink w:history="1" r:id="rId8lx3fb_x-ists4uiroast">
         <w:r>
           <w:rPr>
             <w:rFonts w:ascii="Arial" w:cs="Arial" w:eastAsia="Arial" w:hAnsi="Arial"/>
@@ -70,7 +70,7 @@
         </w:rPr>
         <w:t xml:space="preserve">  ·  </w:t>
       </w:r>
-      <w:hyperlink w:history="1" r:id="rIdd1frykkfw-vvyztrqxlqw">
+      <w:hyperlink w:history="1" r:id="rIdhxfru-8ykh05r3xsntpaq">
         <w:r>
           <w:rPr>
             <w:rFonts w:ascii="Arial" w:cs="Arial" w:eastAsia="Arial" w:hAnsi="Arial"/>
@@ -90,7 +90,7 @@
         </w:rPr>
         <w:t xml:space="preserve">  ·  </w:t>
       </w:r>
-      <w:hyperlink w:history="1" r:id="rIdsgqgigczxz_3joyxa2njy">
+      <w:hyperlink w:history="1" r:id="rIdg7of1wyx4knjurnzre9cd">
         <w:r>
           <w:rPr>
             <w:rFonts w:ascii="Arial" w:cs="Arial" w:eastAsia="Arial" w:hAnsi="Arial"/>
@@ -106,7 +106,7 @@
       <w:pPr>
         <w:spacing w:after="0"/>
       </w:pPr>
-      <w:hyperlink w:history="1" r:id="rIdmdnxfkxbq8mkreyvkpsec">
+      <w:hyperlink w:history="1" r:id="rIdlxv-y7fl2pilbadc63l7q">
         <w:r>
           <w:rPr>
             <w:rFonts w:ascii="Arial" w:cs="Arial" w:eastAsia="Arial" w:hAnsi="Arial"/>
@@ -126,7 +126,7 @@
         </w:rPr>
         <w:t xml:space="preserve">  ·  </w:t>
       </w:r>
-      <w:hyperlink w:history="1" r:id="rIdptmsens3yvursbmsqmlrq">
+      <w:hyperlink w:history="1" r:id="rIdq6liqiiveum12-l2xbd3h">
         <w:r>
           <w:rPr>
             <w:rFonts w:ascii="Arial" w:cs="Arial" w:eastAsia="Arial" w:hAnsi="Arial"/>
@@ -772,7 +772,7 @@
           <w:sz w:val="20"/>
           <w:szCs w:val="20"/>
         </w:rPr>
-        <w:t xml:space="preserve">Implemented CI/CD pipelines using Jenkins and Terraform and automated local blockchain environments to streamline deployments and developer onboarding.</w:t>
+        <w:t xml:space="preserve">Implemented CI/CD pipelines on AWS using Jenkins and Terraform and automated local blockchain environments to streamline deployments and developer onboarding.</w:t>
       </w:r>
     </w:p>
     <w:p>
@@ -1264,7 +1264,7 @@
         </w:rPr>
         <w:t xml:space="preserve">  ·  </w:t>
       </w:r>
-      <w:hyperlink w:history="1" r:id="rIduwwkqiwh5acahxtrigjp6">
+      <w:hyperlink w:history="1" r:id="rIdyghaofz3wlzkqtgq54ypr">
         <w:r>
           <w:rPr>
             <w:rFonts w:ascii="Arial" w:cs="Arial" w:eastAsia="Arial" w:hAnsi="Arial"/>
@@ -1284,7 +1284,7 @@
         </w:rPr>
         <w:t xml:space="preserve">  ·  </w:t>
       </w:r>
-      <w:hyperlink w:history="1" r:id="rIda7flghrxi3r7eiku4cqw_">
+      <w:hyperlink w:history="1" r:id="rIdxxz4xerivuxraetl88vgi">
         <w:r>
           <w:rPr>
             <w:rFonts w:ascii="Arial" w:cs="Arial" w:eastAsia="Arial" w:hAnsi="Arial"/>
@@ -1424,7 +1424,7 @@
         </w:rPr>
         <w:t xml:space="preserve">  ·  </w:t>
       </w:r>
-      <w:hyperlink w:history="1" r:id="rIdllc8llrwfepmjkv5pv3kg">
+      <w:hyperlink w:history="1" r:id="rIdqmqaomiscy_fzecmhgxol">
         <w:r>
           <w:rPr>
             <w:rFonts w:ascii="Arial" w:cs="Arial" w:eastAsia="Arial" w:hAnsi="Arial"/>
@@ -1444,7 +1444,7 @@
         </w:rPr>
         <w:t xml:space="preserve">  ·  </w:t>
       </w:r>
-      <w:hyperlink w:history="1" r:id="rIdfmqoh6tw8xwf_zabisfv2">
+      <w:hyperlink w:history="1" r:id="rIdi6ywibz0s80v94d5nxjdf">
         <w:r>
           <w:rPr>
             <w:rFonts w:ascii="Arial" w:cs="Arial" w:eastAsia="Arial" w:hAnsi="Arial"/>
@@ -1565,7 +1565,7 @@
         </w:rPr>
         <w:t xml:space="preserve">  ·  </w:t>
       </w:r>
-      <w:hyperlink w:history="1" r:id="rIdqjljvdmrdnn5ixyntgpzl">
+      <w:hyperlink w:history="1" r:id="rIdef5cub3bacbzk_qk4v_y_">
         <w:r>
           <w:rPr>
             <w:rFonts w:ascii="Arial" w:cs="Arial" w:eastAsia="Arial" w:hAnsi="Arial"/>
@@ -1585,7 +1585,7 @@
         </w:rPr>
         <w:t xml:space="preserve">  ·  </w:t>
       </w:r>
-      <w:hyperlink w:history="1" r:id="rIdrroitdsg6avgfqtfrcv-2">
+      <w:hyperlink w:history="1" r:id="rIdnbhhrfim3mm3blf33yi4r">
         <w:r>
           <w:rPr>
             <w:rFonts w:ascii="Arial" w:cs="Arial" w:eastAsia="Arial" w:hAnsi="Arial"/>
@@ -1828,7 +1828,7 @@
           <w:sz w:val="20"/>
           <w:szCs w:val="20"/>
         </w:rPr>
-        <w:t xml:space="preserve">Kubernetes, Terraform, Docker, Docker Compose, CI/CD, Infrastructure-as-Code, Linux, Git, Bash, GCP, Azure (AKS), Hetzner</w:t>
+        <w:t xml:space="preserve">Kubernetes, Terraform, Docker, Docker Compose, CI/CD, Infrastructure-as-Code, Linux, Git, Bash, AWS, GCP, Azure (AKS), DigitalOcean, Hetzner</w:t>
       </w:r>
     </w:p>
     <w:p>

</xml_diff>

<commit_message>
content: the four Statecraft deep-dive essays
The rename essay's companions: EnRaHiTu (the single-container
template chassis), Rewriting under governance (the four-day teardown
mechanics), The factory is a service now (framework to control-plane
capability), and One binary, two faces (statecraft-cli as the OPC
successor). No covers yet; heroes to be added later. Feeds and
sitemap regenerated.
</commit_message>
<xml_diff>
--- a/public/Bartlomiej_Kus_Resume.docx
+++ b/public/Bartlomiej_Kus_Resume.docx
@@ -50,7 +50,7 @@
       <w:pPr>
         <w:spacing w:after="0"/>
       </w:pPr>
-      <w:hyperlink w:history="1" r:id="rIdznm37ajkqlqtw8fr0itwz">
+      <w:hyperlink w:history="1" r:id="rIdbmfm0hrp6umcm1ejpgqvm">
         <w:r>
           <w:rPr>
             <w:rFonts w:ascii="Arial" w:cs="Arial" w:eastAsia="Arial" w:hAnsi="Arial"/>
@@ -70,7 +70,7 @@
         </w:rPr>
         <w:t xml:space="preserve">  ·  </w:t>
       </w:r>
-      <w:hyperlink w:history="1" r:id="rId9dqjtzdpxpetdo6myvjkh">
+      <w:hyperlink w:history="1" r:id="rIdmbnr6ud0bsikvdqxdt4dt">
         <w:r>
           <w:rPr>
             <w:rFonts w:ascii="Arial" w:cs="Arial" w:eastAsia="Arial" w:hAnsi="Arial"/>
@@ -90,7 +90,7 @@
         </w:rPr>
         <w:t xml:space="preserve">  ·  </w:t>
       </w:r>
-      <w:hyperlink w:history="1" r:id="rIdp__z9njfzqhfi_v1im0mv">
+      <w:hyperlink w:history="1" r:id="rId3ebbald8dhoeksbuoipif">
         <w:r>
           <w:rPr>
             <w:rFonts w:ascii="Arial" w:cs="Arial" w:eastAsia="Arial" w:hAnsi="Arial"/>
@@ -106,7 +106,7 @@
       <w:pPr>
         <w:spacing w:after="0"/>
       </w:pPr>
-      <w:hyperlink w:history="1" r:id="rIdgbhxjpxgo_anxonzfrnb6">
+      <w:hyperlink w:history="1" r:id="rId8x65wxtvovbrwzjrotuc5">
         <w:r>
           <w:rPr>
             <w:rFonts w:ascii="Arial" w:cs="Arial" w:eastAsia="Arial" w:hAnsi="Arial"/>
@@ -126,7 +126,7 @@
         </w:rPr>
         <w:t xml:space="preserve">  ·  </w:t>
       </w:r>
-      <w:hyperlink w:history="1" r:id="rId6ptelyq6fqvphlahgag_o">
+      <w:hyperlink w:history="1" r:id="rIdmfo0yjfeyhzvutsvv33si">
         <w:r>
           <w:rPr>
             <w:rFonts w:ascii="Arial" w:cs="Arial" w:eastAsia="Arial" w:hAnsi="Arial"/>
@@ -1245,7 +1245,7 @@
         </w:rPr>
         <w:t xml:space="preserve">  ·  </w:t>
       </w:r>
-      <w:hyperlink w:history="1" r:id="rIdna6z88xj6f3rnoiydtszl">
+      <w:hyperlink w:history="1" r:id="rIdhcgjr2jdc9plyesdyra_-">
         <w:r>
           <w:rPr>
             <w:rFonts w:ascii="Arial" w:cs="Arial" w:eastAsia="Arial" w:hAnsi="Arial"/>
@@ -1265,7 +1265,7 @@
         </w:rPr>
         <w:t xml:space="preserve">  ·  </w:t>
       </w:r>
-      <w:hyperlink w:history="1" r:id="rIdvh3vdpn0yrcrmoyomvjui">
+      <w:hyperlink w:history="1" r:id="rIdglj9vioxjviwcg62bwvw6">
         <w:r>
           <w:rPr>
             <w:rFonts w:ascii="Arial" w:cs="Arial" w:eastAsia="Arial" w:hAnsi="Arial"/>
@@ -1405,7 +1405,7 @@
         </w:rPr>
         <w:t xml:space="preserve">  ·  </w:t>
       </w:r>
-      <w:hyperlink w:history="1" r:id="rIdgxneg2zhny8rytteg3hfq">
+      <w:hyperlink w:history="1" r:id="rId7cxmxhunvpwc6m2cq5enb">
         <w:r>
           <w:rPr>
             <w:rFonts w:ascii="Arial" w:cs="Arial" w:eastAsia="Arial" w:hAnsi="Arial"/>
@@ -1425,7 +1425,7 @@
         </w:rPr>
         <w:t xml:space="preserve">  ·  </w:t>
       </w:r>
-      <w:hyperlink w:history="1" r:id="rIdrmm2ykkldjdunvmv-qqzi">
+      <w:hyperlink w:history="1" r:id="rIdq1akw_crkistooz5gwg5j">
         <w:r>
           <w:rPr>
             <w:rFonts w:ascii="Arial" w:cs="Arial" w:eastAsia="Arial" w:hAnsi="Arial"/>
@@ -1546,7 +1546,7 @@
         </w:rPr>
         <w:t xml:space="preserve">  ·  </w:t>
       </w:r>
-      <w:hyperlink w:history="1" r:id="rIddgufbsdvzlwudz8v6ftvf">
+      <w:hyperlink w:history="1" r:id="rIdnxhgauiuekrs9zep69emy">
         <w:r>
           <w:rPr>
             <w:rFonts w:ascii="Arial" w:cs="Arial" w:eastAsia="Arial" w:hAnsi="Arial"/>
@@ -1566,7 +1566,7 @@
         </w:rPr>
         <w:t xml:space="preserve">  ·  </w:t>
       </w:r>
-      <w:hyperlink w:history="1" r:id="rId_wq10ms8n14onzgsk9uch">
+      <w:hyperlink w:history="1" r:id="rId2oyqwmla8tphzkemexbap">
         <w:r>
           <w:rPr>
             <w:rFonts w:ascii="Arial" w:cs="Arial" w:eastAsia="Arial" w:hAnsi="Arial"/>

</xml_diff>